<commit_message>
Probar el cliente movil en tablet real y completar sus capturas
- MenuPage: icono y nombre de cada boton en una sola linea (Android solo mostraba el icono).
- MovimientosPage y OperacionPage: ocultar el teclado al consultar o registrar.
- Capturas del movil en una tablet Samsung SM-P610 (login, menu, movimientos y retiro).
- Manual y presentacion regenerados con esas capturas.
</commit_message>
<xml_diff>
--- a/05. DOCUMENTACIÓN/WS_EUREKABANK_SOAP_DOTNET_BDD_GR01.docx
+++ b/05. DOCUMENTACIÓN/WS_EUREKABANK_SOAP_DOTNET_BDD_GR01.docx
@@ -11162,6 +11162,258 @@
     </w:p>
     <w:p>
       <w:pPr>
+        <w:keepNext/>
+        <w:spacing w:before="120"/>
+        <w:jc w:val="center"/>
+      </w:pPr>
+      <w:r>
+        <w:drawing>
+          <wp:inline distT="0" distB="0" distL="0" distR="0">
+            <wp:extent cx="5715000" cy="3429000"/>
+            <wp:effectExtent t="0" r="0" b="0" l="0"/>
+            <wp:docPr id="27" name="01_login.png" descr="CLIMOV: inicio de sesión en la tablet Samsung SM-P610, con la URL del servidor." title="CLIMOV: inicio de sesión en la tablet Samsung SM-P610, con la URL del servidor."/>
+            <wp:cNvGraphicFramePr>
+              <a:graphicFrameLocks xmlns:a="http://schemas.openxmlformats.org/drawingml/2006/main" noChangeAspect="1"/>
+            </wp:cNvGraphicFramePr>
+            <a:graphic xmlns:a="http://schemas.openxmlformats.org/drawingml/2006/main">
+              <a:graphicData uri="http://schemas.openxmlformats.org/drawingml/2006/picture">
+                <pic:pic xmlns:pic="http://schemas.openxmlformats.org/drawingml/2006/picture">
+                  <pic:nvPicPr>
+                    <pic:cNvPr id="0" name="" descr=""/>
+                    <pic:cNvPicPr>
+                      <a:picLocks noChangeAspect="1" noChangeArrowheads="1"/>
+                    </pic:cNvPicPr>
+                  </pic:nvPicPr>
+                  <pic:blipFill>
+                    <a:blip r:embed="rId35" cstate="none"/>
+                    <a:srcRect/>
+                    <a:stretch>
+                      <a:fillRect/>
+                    </a:stretch>
+                  </pic:blipFill>
+                  <pic:spPr bwMode="auto">
+                    <a:xfrm>
+                      <a:off x="0" y="0"/>
+                      <a:ext cx="5715000" cy="3429000"/>
+                    </a:xfrm>
+                    <a:prstGeom prst="rect">
+                      <a:avLst/>
+                    </a:prstGeom>
+                  </pic:spPr>
+                </pic:pic>
+              </a:graphicData>
+            </a:graphic>
+          </wp:inline>
+        </w:drawing>
+      </w:r>
+    </w:p>
+    <w:p>
+      <w:pPr>
+        <w:spacing w:after="240"/>
+        <w:jc w:val="center"/>
+      </w:pPr>
+      <w:r>
+        <w:rPr>
+          <w:i/>
+          <w:iCs/>
+          <w:color w:val="555555"/>
+          <w:sz w:val="18"/>
+          <w:szCs w:val="18"/>
+        </w:rPr>
+        <w:t xml:space="preserve">Figura 27. CLIMOV: inicio de sesión en la tablet Samsung SM-P610, con la URL del servidor.</w:t>
+      </w:r>
+    </w:p>
+    <w:p>
+      <w:pPr>
+        <w:keepNext/>
+        <w:spacing w:before="120"/>
+        <w:jc w:val="center"/>
+      </w:pPr>
+      <w:r>
+        <w:drawing>
+          <wp:inline distT="0" distB="0" distL="0" distR="0">
+            <wp:extent cx="5715000" cy="3429000"/>
+            <wp:effectExtent t="0" r="0" b="0" l="0"/>
+            <wp:docPr id="28" name="02_menu.png" descr="CLIMOV: menú con las cuatro opciones." title="CLIMOV: menú con las cuatro opciones."/>
+            <wp:cNvGraphicFramePr>
+              <a:graphicFrameLocks xmlns:a="http://schemas.openxmlformats.org/drawingml/2006/main" noChangeAspect="1"/>
+            </wp:cNvGraphicFramePr>
+            <a:graphic xmlns:a="http://schemas.openxmlformats.org/drawingml/2006/main">
+              <a:graphicData uri="http://schemas.openxmlformats.org/drawingml/2006/picture">
+                <pic:pic xmlns:pic="http://schemas.openxmlformats.org/drawingml/2006/picture">
+                  <pic:nvPicPr>
+                    <pic:cNvPr id="0" name="" descr=""/>
+                    <pic:cNvPicPr>
+                      <a:picLocks noChangeAspect="1" noChangeArrowheads="1"/>
+                    </pic:cNvPicPr>
+                  </pic:nvPicPr>
+                  <pic:blipFill>
+                    <a:blip r:embed="rId36" cstate="none"/>
+                    <a:srcRect/>
+                    <a:stretch>
+                      <a:fillRect/>
+                    </a:stretch>
+                  </pic:blipFill>
+                  <pic:spPr bwMode="auto">
+                    <a:xfrm>
+                      <a:off x="0" y="0"/>
+                      <a:ext cx="5715000" cy="3429000"/>
+                    </a:xfrm>
+                    <a:prstGeom prst="rect">
+                      <a:avLst/>
+                    </a:prstGeom>
+                  </pic:spPr>
+                </pic:pic>
+              </a:graphicData>
+            </a:graphic>
+          </wp:inline>
+        </w:drawing>
+      </w:r>
+    </w:p>
+    <w:p>
+      <w:pPr>
+        <w:spacing w:after="240"/>
+        <w:jc w:val="center"/>
+      </w:pPr>
+      <w:r>
+        <w:rPr>
+          <w:i/>
+          <w:iCs/>
+          <w:color w:val="555555"/>
+          <w:sz w:val="18"/>
+          <w:szCs w:val="18"/>
+        </w:rPr>
+        <w:t xml:space="preserve">Figura 28. CLIMOV: menú con las cuatro opciones.</w:t>
+      </w:r>
+    </w:p>
+    <w:p>
+      <w:pPr>
+        <w:keepNext/>
+        <w:spacing w:before="120"/>
+        <w:jc w:val="center"/>
+      </w:pPr>
+      <w:r>
+        <w:drawing>
+          <wp:inline distT="0" distB="0" distL="0" distR="0">
+            <wp:extent cx="5715000" cy="3429000"/>
+            <wp:effectExtent t="0" r="0" b="0" l="0"/>
+            <wp:docPr id="29" name="03_movimientos.png" descr="CLIMOV: cuenta 00200003 con el depósito hecho desde la web (empleado 0012)." title="CLIMOV: cuenta 00200003 con el depósito hecho desde la web (empleado 0012)."/>
+            <wp:cNvGraphicFramePr>
+              <a:graphicFrameLocks xmlns:a="http://schemas.openxmlformats.org/drawingml/2006/main" noChangeAspect="1"/>
+            </wp:cNvGraphicFramePr>
+            <a:graphic xmlns:a="http://schemas.openxmlformats.org/drawingml/2006/main">
+              <a:graphicData uri="http://schemas.openxmlformats.org/drawingml/2006/picture">
+                <pic:pic xmlns:pic="http://schemas.openxmlformats.org/drawingml/2006/picture">
+                  <pic:nvPicPr>
+                    <pic:cNvPr id="0" name="" descr=""/>
+                    <pic:cNvPicPr>
+                      <a:picLocks noChangeAspect="1" noChangeArrowheads="1"/>
+                    </pic:cNvPicPr>
+                  </pic:nvPicPr>
+                  <pic:blipFill>
+                    <a:blip r:embed="rId37" cstate="none"/>
+                    <a:srcRect/>
+                    <a:stretch>
+                      <a:fillRect/>
+                    </a:stretch>
+                  </pic:blipFill>
+                  <pic:spPr bwMode="auto">
+                    <a:xfrm>
+                      <a:off x="0" y="0"/>
+                      <a:ext cx="5715000" cy="3429000"/>
+                    </a:xfrm>
+                    <a:prstGeom prst="rect">
+                      <a:avLst/>
+                    </a:prstGeom>
+                  </pic:spPr>
+                </pic:pic>
+              </a:graphicData>
+            </a:graphic>
+          </wp:inline>
+        </w:drawing>
+      </w:r>
+    </w:p>
+    <w:p>
+      <w:pPr>
+        <w:spacing w:after="240"/>
+        <w:jc w:val="center"/>
+      </w:pPr>
+      <w:r>
+        <w:rPr>
+          <w:i/>
+          <w:iCs/>
+          <w:color w:val="555555"/>
+          <w:sz w:val="18"/>
+          <w:szCs w:val="18"/>
+        </w:rPr>
+        <w:t xml:space="preserve">Figura 29. CLIMOV: cuenta 00200003 con el depósito hecho desde la web (empleado 0012).</w:t>
+      </w:r>
+    </w:p>
+    <w:p>
+      <w:pPr>
+        <w:keepNext/>
+        <w:spacing w:before="120"/>
+        <w:jc w:val="center"/>
+      </w:pPr>
+      <w:r>
+        <w:drawing>
+          <wp:inline distT="0" distB="0" distL="0" distR="0">
+            <wp:extent cx="5715000" cy="3429000"/>
+            <wp:effectExtent t="0" r="0" b="0" l="0"/>
+            <wp:docPr id="30" name="04_operacion.png" descr="CLIMOV: retiro de 100.00 registrado en la cuenta 00200003." title="CLIMOV: retiro de 100.00 registrado en la cuenta 00200003."/>
+            <wp:cNvGraphicFramePr>
+              <a:graphicFrameLocks xmlns:a="http://schemas.openxmlformats.org/drawingml/2006/main" noChangeAspect="1"/>
+            </wp:cNvGraphicFramePr>
+            <a:graphic xmlns:a="http://schemas.openxmlformats.org/drawingml/2006/main">
+              <a:graphicData uri="http://schemas.openxmlformats.org/drawingml/2006/picture">
+                <pic:pic xmlns:pic="http://schemas.openxmlformats.org/drawingml/2006/picture">
+                  <pic:nvPicPr>
+                    <pic:cNvPr id="0" name="" descr=""/>
+                    <pic:cNvPicPr>
+                      <a:picLocks noChangeAspect="1" noChangeArrowheads="1"/>
+                    </pic:cNvPicPr>
+                  </pic:nvPicPr>
+                  <pic:blipFill>
+                    <a:blip r:embed="rId38" cstate="none"/>
+                    <a:srcRect/>
+                    <a:stretch>
+                      <a:fillRect/>
+                    </a:stretch>
+                  </pic:blipFill>
+                  <pic:spPr bwMode="auto">
+                    <a:xfrm>
+                      <a:off x="0" y="0"/>
+                      <a:ext cx="5715000" cy="3429000"/>
+                    </a:xfrm>
+                    <a:prstGeom prst="rect">
+                      <a:avLst/>
+                    </a:prstGeom>
+                  </pic:spPr>
+                </pic:pic>
+              </a:graphicData>
+            </a:graphic>
+          </wp:inline>
+        </w:drawing>
+      </w:r>
+    </w:p>
+    <w:p>
+      <w:pPr>
+        <w:spacing w:after="240"/>
+        <w:jc w:val="center"/>
+      </w:pPr>
+      <w:r>
+        <w:rPr>
+          <w:i/>
+          <w:iCs/>
+          <w:color w:val="555555"/>
+          <w:sz w:val="18"/>
+          <w:szCs w:val="18"/>
+        </w:rPr>
+        <w:t xml:space="preserve">Figura 30. CLIMOV: retiro de 100.00 registrado en la cuenta 00200003.</w:t>
+      </w:r>
+    </w:p>
+    <w:p>
+      <w:pPr>
         <w:pStyle w:val="Heading1"/>
       </w:pPr>
       <w:bookmarkStart w:name="_Toc23" w:id="23"/>
@@ -11176,7 +11428,7 @@
         <w:jc w:val="both"/>
       </w:pPr>
       <w:r>
-        <w:t xml:space="preserve">Las pruebas se ejecutaron con la base recién creada (crear_bdd.ps1), el servidor en IIS Express y cada cliente en la misma PC; para el trabajo en red el servidor se publica en IIS y los clientes usan la IP de Wi-Fi.</w:t>
+        <w:t xml:space="preserve">Las pruebas se ejecutaron con la base recién creada (crear_bdd.ps1) y el servidor en IIS Express. Primero en orden consola → escritorio → web → móvil (tablet Samsung SM-P610 por cable con adb reverse), cada cliente operando sobre lo que dejó el anterior: el depósito hecho en la web aparece en el móvil, lo que demuestra que todos comparten la misma base de datos. Para el trabajo en red el servidor se publica en IIS y los clientes usan la IP de Wi-Fi.</w:t>
       </w:r>
     </w:p>
     <w:tbl>

</xml_diff>

<commit_message>
Nuevas capturas (consola, escritorio, web y servidor en IIS) con monster69 e imagen; manual y presentacion regenerados
</commit_message>
<xml_diff>
--- a/05. DOCUMENTACIÓN/WS_EUREKABANK_SOAP_DOTNET_BDD_GR01.docx
+++ b/05. DOCUMENTACIÓN/WS_EUREKABANK_SOAP_DOTNET_BDD_GR01.docx
@@ -6829,7 +6829,7 @@
                 <w:sz w:val="16"/>
                 <w:szCs w:val="16"/>
               </w:rPr>
-              <w:t xml:space="preserve">    Description = "EurekaBank · SOAP .NET con SQL Server. Usuario de prueba: monster / monster (código de empleado 0012). Cuentas de ejemplo: 00100001, 00200001, 00200002.")]</w:t>
+              <w:t xml:space="preserve">    Description = "EurekaBank · SOAP .NET con SQL Server. Usuario de prueba: monster / monster69 (código de empleado 0012). Cuentas de ejemplo: 00100001, 00200001, 00200002.")]</w:t>
             </w:r>
           </w:p>
           <w:p>
@@ -9166,7 +9166,7 @@
       <w:r>
         <w:drawing>
           <wp:inline distT="0" distB="0" distL="0" distR="0">
-            <wp:extent cx="3190875" cy="3810000"/>
+            <wp:extent cx="5715000" cy="3495675"/>
             <wp:effectExtent t="0" r="0" b="0" l="0"/>
             <wp:docPr id="14" name="01_login_error.png" descr="CLIESC: inicio de sesión con el mensaje de intentos restantes que envía el servidor." title="CLIESC: inicio de sesión con el mensaje de intentos restantes que envía el servidor."/>
             <wp:cNvGraphicFramePr>
@@ -9191,7 +9191,7 @@
                   <pic:spPr bwMode="auto">
                     <a:xfrm>
                       <a:off x="0" y="0"/>
-                      <a:ext cx="3190875" cy="3810000"/>
+                      <a:ext cx="5715000" cy="3495675"/>
                     </a:xfrm>
                     <a:prstGeom prst="rect">
                       <a:avLst/>

</xml_diff>